<commit_message>
Tailored resume for: jd/data enginer.txt
</commit_message>
<xml_diff>
--- a/output/Rehan_Malik_Resume_data_enginer.docx
+++ b/output/Rehan_Malik_Resume_data_enginer.docx
@@ -274,7 +274,7 @@
         <w:ind w:left="2115" w:leftChars="0" w:hanging="360"/>
       </w:pPr>
       <w:r>
-        <w:t>Designed and deployed real-time voice-to-data ingestion engines using WebSockets, Apache Kafka, and streaming architectures, aligning with modern cloud-based data platform practices.</w:t>
+        <w:t>Designed and deployed real-time voice-to-data ingestion engines using WebSockets, Apache Kafka, and streaming architectures, enabling scalable concurrent processing of 500+ calls.</w:t>
       </w:r>
     </w:p>
     <w:p>
@@ -286,7 +286,7 @@
         <w:ind w:left="2115" w:leftChars="0" w:hanging="360"/>
       </w:pPr>
       <w:r>
-        <w:t>Developed autonomous data pipelines for SEO and content workflows, showcasing expertise in orchestration frameworks and end-to-end data transformation.</w:t>
+        <w:t>Developed autonomous AI-powered platforms with end-to-end data pipelines, leveraging LangChain Agents and LLM orchestration to deliver production-grade solutions without human intervention.</w:t>
       </w:r>
     </w:p>
     <w:p>
@@ -298,7 +298,7 @@
         <w:ind w:left="2115" w:leftChars="0" w:hanging="360"/>
       </w:pPr>
       <w:r>
-        <w:t>Optimized ETL pipelines and implemented data partitioning strategies, increasing cloud infrastructure processing capacity by 60% to handle datasets exceeding 2TB.</w:t>
+        <w:t>Optimized cloud-based architectures to process 2TB+ datasets, increasing system efficiency by 60% through advanced ETL pipelines and data partitioning techniques.</w:t>
       </w:r>
     </w:p>
     <w:p>
@@ -310,7 +310,7 @@
         <w:ind w:left="2115" w:leftChars="0" w:hanging="360"/>
       </w:pPr>
       <w:r>
-        <w:t>Engineered scalable and resilient cloud backends on AWS (ECS, Lambda, S3, RDS) and GCP, supporting large-scale data and machine learning workloads.</w:t>
+        <w:t>Engineered resilient cloud backends on AWS and GCP, supporting large-scale AI and ML workloads with scalable and cost-efficient infrastructure.</w:t>
       </w:r>
     </w:p>
     <w:p>
@@ -322,7 +322,7 @@
         <w:ind w:left="2115" w:leftChars="0" w:hanging="360"/>
       </w:pPr>
       <w:r>
-        <w:t>Built high-performance gRPC microservices with C++ modules, reducing model inference latency by 25% and enhancing concurrent user capacity by 15%.</w:t>
+        <w:t>Built high-performance microservices with gRPC and C++ modules, improving model inference latency by 25% and enabling seamless scaling for concurrent users.</w:t>
       </w:r>
     </w:p>
     <w:p>
@@ -334,7 +334,7 @@
         <w:ind w:left="2115" w:leftChars="0" w:hanging="360"/>
       </w:pPr>
       <w:r>
-        <w:t>Designed retrieval-augmented generation pipelines with LangChain, FAISS, and ChromaDB, ensuring reliable and reusable data products for enterprise knowledge retrieval.</w:t>
+        <w:t>Implemented enterprise-grade retrieval-augmented generation (RAG) pipelines using LangChain, FAISS, and ChromaDB to deliver reliable knowledge retrieval systems across diverse data sources.</w:t>
       </w:r>
     </w:p>
     <w:p>
@@ -346,7 +346,7 @@
         <w:ind w:left="2115" w:leftChars="0" w:hanging="360"/>
       </w:pPr>
       <w:r>
-        <w:t>Implemented reinforcement learning frameworks to improve the performance and reliability of production-grade machine learning models.</w:t>
+        <w:t>Enhanced production LLM systems with reinforcement learning frameworks, improving model accuracy and reliability through optimized PPO techniques.</w:t>
       </w:r>
     </w:p>
     <w:p>
@@ -358,7 +358,7 @@
         <w:ind w:left="2115" w:leftChars="0" w:hanging="360"/>
       </w:pPr>
       <w:r>
-        <w:t>Developed real-time audio processing pipelines for speech-to-text and sentiment analysis, leveraging streaming architectures to deliver reliable and scalable data services.</w:t>
+        <w:t>Developed real-time streaming pipelines for audio processing, including speech-to-text, sentiment analysis, and actionable insights, leveraging scalable cloud architectures.</w:t>
       </w:r>
     </w:p>
     <w:p>
@@ -447,7 +447,7 @@
         <w:t xml:space="preserve"> </w:t>
       </w:r>
       <w:r>
-        <w:t xml:space="preserve">Senior Data Engineering &amp; AI Specialist </w:t>
+        <w:t xml:space="preserve">Senior AI Engineer </w:t>
       </w:r>
     </w:p>
     <w:p>
@@ -459,7 +459,7 @@
         <w:ind w:left="2115" w:leftChars="0" w:hanging="360"/>
       </w:pPr>
       <w:r>
-        <w:t>Designed and implemented scalable data architectures and orchestration patterns for Generative AI in regulated environments, ensuring resilience and cost efficiency.</w:t>
+        <w:t>Led the design and implementation of scalable data architectures and AI orchestration patterns, driving a $1M+ enterprise transformation initiative in regulated environments.</w:t>
       </w:r>
     </w:p>
     <w:p>
@@ -471,7 +471,7 @@
         <w:ind w:left="2115" w:leftChars="0" w:hanging="360"/>
       </w:pPr>
       <w:r>
-        <w:t>Developed advanced data pipelines for ingesting, transforming, and structuring business documents into reusable technical assets, leveraging cloud-based GenAI solutions.</w:t>
+        <w:t>Developed and deployed production-grade AI pipelines for ingesting, transforming, and structuring business documents into technical assets using LLMs and orchestration frameworks.</w:t>
       </w:r>
     </w:p>
     <w:p>
@@ -483,7 +483,7 @@
         <w:ind w:left="2115" w:leftChars="0" w:hanging="360"/>
       </w:pPr>
       <w:r>
-        <w:t>Evaluated and deployed streaming-first GenAI orchestration frameworks, ensuring alignment with cloud architecture standards and governance requirements.</w:t>
+        <w:t>Evaluated and integrated advanced AI orchestration technologies, including LangChain and multi-agent frameworks, to meet cloud infrastructure and compliance requirements.</w:t>
       </w:r>
     </w:p>
     <w:p>
@@ -495,7 +495,7 @@
         <w:ind w:left="2115" w:leftChars="0" w:hanging="360"/>
       </w:pPr>
       <w:r>
-        <w:t>Established audit-ready data lineage and governance frameworks, ensuring traceability and compliance with organizational and regulatory standards.</w:t>
+        <w:t>Designed and implemented audit-ready data lineage frameworks, ensuring governance, traceability, and performance optimization across AI deliverables.</w:t>
       </w:r>
     </w:p>
     <w:p>
@@ -507,7 +507,7 @@
         <w:ind w:left="2115" w:leftChars="0" w:hanging="360"/>
       </w:pPr>
       <w:r>
-        <w:t>Built domain-specific knowledge grounding mechanisms using Retrieval-Augmented Generation (RAG) to ensure reliable, discoverable, and governed AI outputs.</w:t>
+        <w:t>Built and optimized retrieval-augmented generation (RAG) architectures to enhance LLM outputs with reliable, domain-specific knowledge for regulated use cases.</w:t>
       </w:r>
     </w:p>
     <w:p>
@@ -519,7 +519,7 @@
         <w:ind w:left="2115" w:leftChars="0" w:hanging="360"/>
       </w:pPr>
       <w:r>
-        <w:t>Collaborated with senior stakeholders to drive strategic adoption of AI technologies, leading validation sessions to ensure safe and effective integration into production workflows.</w:t>
+        <w:t>Collaborated with cross-functional stakeholders and led validation sessions to ensure safe and effective integration of AI-generated outputs into production systems.</w:t>
       </w:r>
     </w:p>
     <w:p>
@@ -790,7 +790,7 @@
         <w:ind w:left="2115" w:leftChars="0" w:hanging="360"/>
       </w:pPr>
       <w:r>
-        <w:t>Translated complex business data challenges into scalable, cloud-native solutions, aligning with modern cloud-based data platform strategies across AWS, Azure, and GCP.</w:t>
+        <w:t>Translated complex business data challenges into scalable cloud-based architectures, leveraging AWS, Azure, and GCP to enhance resilience and cost efficiency.</w:t>
       </w:r>
     </w:p>
     <w:p>
@@ -802,7 +802,7 @@
         <w:ind w:left="2115" w:leftChars="0" w:hanging="360"/>
       </w:pPr>
       <w:r>
-        <w:t>Designed and implemented AI-driven data pipelines and automation tools, ensuring integration with enterprise data ecosystems and adherence to governance standards.</w:t>
+        <w:t>Designed and implemented AI-powered data pipelines and orchestration workflows, ensuring seamless integration with enterprise data ecosystems.</w:t>
       </w:r>
     </w:p>
     <w:p>
@@ -814,7 +814,7 @@
         <w:ind w:left="2115" w:leftChars="0" w:hanging="360"/>
       </w:pPr>
       <w:r>
-        <w:t>Developed and optimized ETL/ELT workflows, cloud data migrations, and real-time processing pipelines, supporting both batch and streaming data architectures.</w:t>
+        <w:t>Developed streaming-first and batch processing solutions, optimizing data ingestion, transformation, and real-time processing pipelines.</w:t>
       </w:r>
     </w:p>
     <w:p>
@@ -826,7 +826,7 @@
         <w:ind w:left="2115" w:leftChars="0" w:hanging="360"/>
       </w:pPr>
       <w:r>
-        <w:t>Led client-facing reviews to align cloud infrastructure and data architecture roadmaps with strategic technical direction and organizational goals.</w:t>
+        <w:t>Collaborated with stakeholders to align cloud infrastructure and data architecture strategies with organizational goals through regular reviews.</w:t>
       </w:r>
     </w:p>
     <w:p>
@@ -838,7 +838,7 @@
         <w:ind w:left="2115" w:leftChars="0" w:hanging="360"/>
       </w:pPr>
       <w:r>
-        <w:t>Ensured compliance with security, observability, and performance standards across cloud data deployments, achieving operational efficiency and scalability.</w:t>
+        <w:t>Ensured robust security, observability, and performance optimization across all cloud deployments, reducing manual operational overhead.</w:t>
       </w:r>
     </w:p>
     <w:p>
@@ -1020,7 +1020,7 @@
         <w:ind w:left="1360"/>
       </w:pPr>
       <w:r>
-        <w:t xml:space="preserve">Senior Data &amp; ML Engineer </w:t>
+        <w:t xml:space="preserve">Senior AI/ML Engineer </w:t>
       </w:r>
     </w:p>
     <w:p>
@@ -1032,7 +1032,7 @@
         <w:ind w:left="2115" w:leftChars="0" w:hanging="360"/>
       </w:pPr>
       <w:r>
-        <w:t>Developed scalable data pipelines for context-aware enterprise search across 2TB+ document repositories, leveraging LangChain, FAISS, and ChromaDB to ensure reliability and discoverability.</w:t>
+        <w:t>Built production-grade RAG pipelines using LangChain, FAISS, and ChromaDB to enable scalable enterprise search across large document repositories.</w:t>
       </w:r>
     </w:p>
     <w:p>
@@ -1044,7 +1044,7 @@
         <w:ind w:left="2115" w:leftChars="0" w:hanging="360"/>
       </w:pPr>
       <w:r>
-        <w:t>Engineered end-to-end data workflows including ingestion, transformation, validation, and orchestration using Python, PySpark, and Airflow, adhering to best practices for scalability and resilience.</w:t>
+        <w:t>Designed and implemented robust data pipelines for ingestion, transformation, validation, and model serving, leveraging Python, PySpark, and Airflow for scalability and reliability.</w:t>
       </w:r>
     </w:p>
     <w:p>
@@ -1056,7 +1056,7 @@
         <w:ind w:left="2115" w:leftChars="0" w:hanging="360"/>
       </w:pPr>
       <w:r>
-        <w:t>Optimized deployment of fine-tuned LLMs (LLaMA, Mistral) on AWS SageMaker using LoRA, QLoRA, and PEFT, achieving a 40% reduction in API costs compared to hosted models.</w:t>
+        <w:t>Deployed fine-tuned LLMs such as LLaMA and Mistral using techniques like LoRA and QLoRA on AWS SageMaker, achieving significant cost reductions compared to hosted models.</w:t>
       </w:r>
     </w:p>
     <w:p>
@@ -1068,7 +1068,7 @@
         <w:ind w:left="2115" w:leftChars="0" w:hanging="360"/>
       </w:pPr>
       <w:r>
-        <w:t>Implemented high-performance model serving with VLLM and CUDA for efficient GPU utilization, containerized using Docker on AWS ECS/ECR for scalability and cost efficiency.</w:t>
+        <w:t>Optimized GPU utilization for scalable model serving using VLLM and CUDA, containerized with Docker and deployed on AWS ECS/ECR for efficient infrastructure management.</w:t>
       </w:r>
     </w:p>
     <w:p>
@@ -1080,7 +1080,7 @@
         <w:ind w:left="2115" w:leftChars="0" w:hanging="360"/>
       </w:pPr>
       <w:r>
-        <w:t>Developed autonomous AI workflows by integrating LLMs with internal APIs, databases, and messaging platforms, championing the "data as a product" approach.</w:t>
+        <w:t>Developed AI workflows connecting LLMs to APIs, databases, and messaging platforms to support autonomous task execution and seamless system integration.</w:t>
       </w:r>
     </w:p>
     <w:p>
@@ -1092,7 +1092,7 @@
         <w:ind w:left="2115" w:leftChars="0" w:hanging="360"/>
       </w:pPr>
       <w:r>
-        <w:t>Enhanced performance of inference pipelines by integrating C++ modules, reducing model latency by 25% and ensuring optimal system performance.</w:t>
+        <w:t>Integrated C++ modules into inference pipelines to enhance performance, reducing model latency and improving system responsiveness.</w:t>
       </w:r>
     </w:p>
     <w:p>
@@ -1104,7 +1104,7 @@
         <w:ind w:left="2115" w:leftChars="0" w:hanging="360"/>
       </w:pPr>
       <w:r>
-        <w:t>Designed real-time streaming data pipelines for audio processing and speech-to-text applications, ensuring robust and efficient data handling.</w:t>
+        <w:t>Designed real-time audio processing and speech-to-text pipelines for streaming architectures, ensuring high reliability and low latency.</w:t>
       </w:r>
     </w:p>
     <w:p>
@@ -1116,7 +1116,7 @@
         <w:ind w:left="2115" w:leftChars="0" w:hanging="360"/>
       </w:pPr>
       <w:r>
-        <w:t>Built high-performance conversational APIs powered by OpenAI, improving response times by 35% and supporting seamless customer interactions.</w:t>
+        <w:t>Built high-performance conversational APIs leveraging OpenAI technologies, achieving substantial improvements in response times and user experience.</w:t>
       </w:r>
     </w:p>
     <w:p>
@@ -1281,7 +1281,7 @@
         <w:ind w:left="1360"/>
       </w:pPr>
       <w:r>
-        <w:t xml:space="preserve">Senior Data Engineer </w:t>
+        <w:t xml:space="preserve">Senior Data &amp; Machine Learning Engineer </w:t>
       </w:r>
     </w:p>
     <w:p>
@@ -1293,7 +1293,7 @@
         <w:ind w:left="2115" w:leftChars="0" w:hanging="360"/>
       </w:pPr>
       <w:r>
-        <w:t>Owned and enhanced ETL pipelines for large-scale production data, ensuring scalability, resilience, and data quality to support high-revenue accounts exceeding $200K monthly.</w:t>
+        <w:t>Managed and optimized scalable ETL pipelines within cloud-based environments, ensuring data reliability, quality, and timely availability for high-impact machine learning applications.</w:t>
       </w:r>
     </w:p>
     <w:p>
@@ -1305,7 +1305,7 @@
         <w:ind w:left="2115" w:leftChars="0" w:hanging="360"/>
       </w:pPr>
       <w:r>
-        <w:t>Defined and implemented data quality standards, pipeline performance metrics, and model evaluation processes, optimizing outcomes for accounts generating $1M+ annually.</w:t>
+        <w:t>Evaluated and enhanced data quality and pipeline performance, aligning with stringent production-grade standards to support large-scale AI systems and workflows.</w:t>
       </w:r>
     </w:p>
     <w:p>
@@ -1317,7 +1317,7 @@
         <w:ind w:left="2115" w:leftChars="0" w:hanging="360"/>
       </w:pPr>
       <w:r>
-        <w:t>Directed feature engineering and data preparation workflows to ensure reliable, reusable, and high-quality datasets for machine learning and data science initiatives.</w:t>
+        <w:t>Led feature engineering and data preparation processes, enabling robust training datasets for AI/ML models and ensuring readiness for production deployment.</w:t>
       </w:r>
     </w:p>
     <w:p>
@@ -1329,7 +1329,7 @@
         <w:ind w:left="2115" w:leftChars="0" w:hanging="360"/>
       </w:pPr>
       <w:r>
-        <w:t>Developed and maintained real-time data monitoring and reporting solutions using SQL, PostgreSQL, Grafana, and Tableau, ensuring observability and actionable insights.</w:t>
+        <w:t>Developed real-time data monitoring and reporting solutions using SQL, PostgreSQL, Grafana, and Tableau to optimize system performance and observability.</w:t>
       </w:r>
     </w:p>
     <w:p>
@@ -1341,7 +1341,7 @@
         <w:ind w:left="2115" w:leftChars="0" w:hanging="360"/>
       </w:pPr>
       <w:r>
-        <w:t>Collaborated with cross-functional teams to drive effective problem-solving and maintain operational excellence in a high-impact, fast-paced production environment.</w:t>
+        <w:t>Collaborated with cross-functional teams to deliver end-to-end solutions in fast-paced, high-ownership environments using tools like Jira, Slack, and Trello.</w:t>
       </w:r>
     </w:p>
     <w:p>
@@ -1525,7 +1525,7 @@
         <w:ind w:left="2115" w:leftChars="0" w:hanging="360"/>
       </w:pPr>
       <w:r>
-        <w:t>Maintained and optimized production ETL pipelines and ML operations, ensuring scalability, resilience, and data integrity across enterprise data platforms.</w:t>
+        <w:t>Maintained and optimized production data pipelines and ML operations, ensuring scalability, resilience, and data integrity across enterprise systems.</w:t>
       </w:r>
     </w:p>
     <w:p>
@@ -1537,7 +1537,7 @@
         <w:ind w:left="2115" w:leftChars="0" w:hanging="360"/>
       </w:pPr>
       <w:r>
-        <w:t>Developed and integrated churn risk models into decision-making systems, driving data-informed strategies to enhance operational efficiency.</w:t>
+        <w:t>Developed predictive models integrated into operational workflows to enhance decision-making and improve key performance metrics.</w:t>
       </w:r>
     </w:p>
     <w:p>
@@ -1549,7 +1549,7 @@
         <w:ind w:left="2115" w:leftChars="0" w:hanging="360"/>
       </w:pPr>
       <w:r>
-        <w:t>Performed in-depth production data analysis using SQL, PostgreSQL, Grafana, and Tableau to ensure observability and performance optimization.</w:t>
+        <w:t>Performed data analysis using SQL, PostgreSQL, and visualization tools to monitor system performance and ensure reliability.</w:t>
       </w:r>
     </w:p>
     <w:p>
@@ -1561,7 +1561,7 @@
         <w:ind w:left="2115" w:leftChars="0" w:hanging="360"/>
       </w:pPr>
       <w:r>
-        <w:t>Led incident management processes through JIRA, collaborating with cross-functional teams to uphold reliability and minimize downtime.</w:t>
+        <w:t>Managed incident workflows and collaborated with cross-functional teams to resolve pipeline issues and maintain operational efficiency.</w:t>
       </w:r>
     </w:p>
     <w:p>
@@ -1720,7 +1720,7 @@
         <w:ind w:left="1360"/>
       </w:pPr>
       <w:r>
-        <w:t xml:space="preserve">Junior Data Platform Engineer </w:t>
+        <w:t xml:space="preserve">Junior Cloud Data Engineer </w:t>
       </w:r>
     </w:p>
     <w:p>
@@ -1732,7 +1732,7 @@
         <w:ind w:left="2115" w:leftChars="0" w:hanging="360"/>
       </w:pPr>
       <w:r>
-        <w:t>Designed and implemented scalable data pipelines for ingestion, transformation, and analysis of IoT sensor data, ensuring reliability and performance.</w:t>
+        <w:t>Designed and implemented scalable data pipelines to ingest, transform, and analyze IoT sensor data, ensuring reliability and performance optimization.</w:t>
       </w:r>
     </w:p>
     <w:p>
@@ -1744,7 +1744,7 @@
         <w:ind w:left="2115" w:leftChars="0" w:hanging="360"/>
       </w:pPr>
       <w:r>
-        <w:t>Developed and optimized data workflows leveraging Python, PostgreSQL, MySQL, and DBeaver to support data modeling, transformation, and pattern detection.</w:t>
+        <w:t>Developed analytical workflows leveraging Python and SQL-based databases to support data modeling, transformation, and anomaly detection in IoT datasets.</w:t>
       </w:r>
     </w:p>
     <w:p>
@@ -1756,7 +1756,7 @@
         <w:ind w:left="2115" w:leftChars="0" w:hanging="360"/>
       </w:pPr>
       <w:r>
-        <w:t>Built dynamic dashboards and data visualizations in Power BI Desktop to deliver actionable insights and support data-driven decision-making.</w:t>
+        <w:t>Built dynamic dashboards and visualizations in Power BI to enhance data discoverability and support stakeholder decision-making processes.</w:t>
       </w:r>
     </w:p>
     <w:p>
@@ -1768,7 +1768,7 @@
         <w:ind w:left="2115" w:leftChars="0" w:hanging="360"/>
       </w:pPr>
       <w:r>
-        <w:t>Utilized machine learning techniques, including clustering and anomaly detection, to enhance predictive maintenance capabilities for IoT time-series data.</w:t>
+        <w:t>Applied machine learning techniques, including clustering and anomaly detection, to generate actionable insights and improve predictive maintenance workflows.</w:t>
       </w:r>
     </w:p>
     <w:p>
@@ -2084,106 +2084,106 @@
         <w:rPr>
           <w:b/>
         </w:rPr>
+        <w:t xml:space="preserve">Core ML &amp; AI: </w:t>
+      </w:r>
+      <w:r>
+        <w:t>Python, TensorFlow, PyTorch, scikit-learn, C++, OpenCV, RLHF, PPO, Quantization, FastAPI, Flask, gRPC, REST APIs, WebSockets, Shell Scripting, CUDA.</w:t>
+      </w:r>
+      <w:r>
+        <w:rPr>
+          <w:b/>
+        </w:rPr>
+        <w:t xml:space="preserve"> </w:t>
+      </w:r>
+      <w:r>
+        <w:rPr>
+          <w:b/>
+        </w:rPr>
+        <w:br w:type="textWrapping"/>
+      </w:r>
+    </w:p>
+    <w:p>
+      <w:pPr>
+        <w:ind w:left="1350" w:hanging="1350"/>
+      </w:pPr>
+      <w:r>
+        <w:t xml:space="preserve"> </w:t>
+      </w:r>
+      <w:r>
+        <w:tab/>
+      </w:r>
+      <w:r>
+        <w:rPr>
+          <w:b/>
+        </w:rPr>
+        <w:t xml:space="preserve">GenAI &amp; LLMs: </w:t>
+      </w:r>
+      <w:r>
+        <w:t>LangChain, RAG Architectures, OpenAI, Claude/Anthropic, LLaMA, Mistral, Hugging Face, Fine-Tuning (LoRA, QLoRA, PEFT), VLLM, Prompt Engineering, FAISS, ChromaDB, Pinecone, PG-Vector, Agentic AI.</w:t>
+      </w:r>
+      <w:r>
+        <w:rPr>
+          <w:b/>
+        </w:rPr>
+        <w:t xml:space="preserve"> </w:t>
+      </w:r>
+      <w:r>
+        <w:rPr>
+          <w:b/>
+        </w:rPr>
+        <w:br w:type="textWrapping"/>
+      </w:r>
+    </w:p>
+    <w:p>
+      <w:pPr>
+        <w:ind w:left="1350" w:hanging="1350"/>
+      </w:pPr>
+      <w:r>
+        <w:t xml:space="preserve"> </w:t>
+      </w:r>
+      <w:r>
+        <w:tab/>
+      </w:r>
+      <w:r>
+        <w:rPr>
+          <w:b/>
+        </w:rPr>
+        <w:t xml:space="preserve">AWS &amp; Cloud: </w:t>
+      </w:r>
+      <w:r>
+        <w:t>AWS (SageMaker, ECS, Lambda, S3, RDS, ECR), Docker, Kubernetes, Terraform, CI/CD, Microservices, Azure, GCP.</w:t>
+      </w:r>
+      <w:r>
+        <w:rPr>
+          <w:b/>
+        </w:rPr>
+        <w:t xml:space="preserve"> </w:t>
+      </w:r>
+      <w:r>
+        <w:rPr>
+          <w:b/>
+        </w:rPr>
+        <w:br w:type="textWrapping"/>
+      </w:r>
+    </w:p>
+    <w:p>
+      <w:pPr>
+        <w:ind w:left="1350" w:hanging="1350"/>
+      </w:pPr>
+      <w:r>
+        <w:t xml:space="preserve"> </w:t>
+      </w:r>
+      <w:r>
+        <w:tab/>
+      </w:r>
+      <w:r>
+        <w:rPr>
+          <w:b/>
+        </w:rPr>
         <w:t xml:space="preserve">Data Engineering: </w:t>
       </w:r>
       <w:r>
-        <w:t>Real-Time Streaming, Apache Kafka, PySpark, Apache Airflow, dbt, ETL/ELT Pipelines, Data Modeling, Data Warehousing, Data Quality, PostgreSQL, Redis, MongoDB, MySQL, DynamoDB, SQL, Grafana, Tableau, Power BI.</w:t>
-      </w:r>
-      <w:r>
-        <w:rPr>
-          <w:b/>
-        </w:rPr>
-        <w:t xml:space="preserve"> </w:t>
-      </w:r>
-      <w:r>
-        <w:rPr>
-          <w:b/>
-        </w:rPr>
-        <w:br w:type="textWrapping"/>
-      </w:r>
-    </w:p>
-    <w:p>
-      <w:pPr>
-        <w:ind w:left="1350" w:hanging="1350"/>
-      </w:pPr>
-      <w:r>
-        <w:t xml:space="preserve"> </w:t>
-      </w:r>
-      <w:r>
-        <w:tab/>
-      </w:r>
-      <w:r>
-        <w:rPr>
-          <w:b/>
-        </w:rPr>
-        <w:t xml:space="preserve">AWS &amp; Cloud: </w:t>
-      </w:r>
-      <w:r>
-        <w:t>AWS (ECS, ECR, Lambda, S3, SageMaker, RDS), CI/CD, Docker, Kubernetes, Terraform, Microservices, Azure, GCP.</w:t>
-      </w:r>
-      <w:r>
-        <w:rPr>
-          <w:b/>
-        </w:rPr>
-        <w:t xml:space="preserve"> </w:t>
-      </w:r>
-      <w:r>
-        <w:rPr>
-          <w:b/>
-        </w:rPr>
-        <w:br w:type="textWrapping"/>
-      </w:r>
-    </w:p>
-    <w:p>
-      <w:pPr>
-        <w:ind w:left="1350" w:hanging="1350"/>
-      </w:pPr>
-      <w:r>
-        <w:t xml:space="preserve"> </w:t>
-      </w:r>
-      <w:r>
-        <w:tab/>
-      </w:r>
-      <w:r>
-        <w:rPr>
-          <w:b/>
-        </w:rPr>
-        <w:t xml:space="preserve">Core ML &amp; AI: </w:t>
-      </w:r>
-      <w:r>
-        <w:t>Python, PyTorch, TensorFlow, scikit-learn, RLHF, PPO, CUDA, Quantization, FastAPI, Flask, gRPC, REST APIs, WebSockets, Shell Scripting, OpenCV, C++.</w:t>
-      </w:r>
-      <w:r>
-        <w:rPr>
-          <w:b/>
-        </w:rPr>
-        <w:t xml:space="preserve"> </w:t>
-      </w:r>
-      <w:r>
-        <w:rPr>
-          <w:b/>
-        </w:rPr>
-        <w:br w:type="textWrapping"/>
-      </w:r>
-    </w:p>
-    <w:p>
-      <w:pPr>
-        <w:ind w:left="1350" w:hanging="1350"/>
-      </w:pPr>
-      <w:r>
-        <w:t xml:space="preserve"> </w:t>
-      </w:r>
-      <w:r>
-        <w:tab/>
-      </w:r>
-      <w:r>
-        <w:rPr>
-          <w:b/>
-        </w:rPr>
-        <w:t xml:space="preserve">GenAI &amp; LLMs: </w:t>
-      </w:r>
-      <w:r>
-        <w:t>LangChain, RAG Architectures, Agentic AI, Fine-Tuning (LoRA, QLoRA, PEFT), OpenAI, Claude/Anthropic, LLaMA, Mistral, Hugging Face, VLLM, Prompt Engineering, FAISS, ChromaDB, Pinecone, PG-Vector.</w:t>
+        <w:t>Apache Kafka, PySpark, Apache Airflow, ETL/ELT Pipelines, Real-Time Streaming, dbt, Data Warehousing, PostgreSQL, MongoDB, Redis, MySQL, DynamoDB, SQL, Grafana, Tableau, Power BI, Data Modeling, Data Quality.</w:t>
       </w:r>
       <w:r>
         <w:rPr>

</xml_diff>